<commit_message>
Update Clinical record engine - design implementation and evaluation.docx
</commit_message>
<xml_diff>
--- a/Clinical record engine - design implementation and evaluation.docx
+++ b/Clinical record engine - design implementation and evaluation.docx
@@ -5905,7 +5905,7 @@
                 <w:sz w:val="19"/>
                 <w:szCs w:val="19"/>
               </w:rPr>
-              <w:t xml:space="preserve">130 tests</w:t>
+              <w:t xml:space="preserve">144 tests</w:t>
             </w:r>
           </w:p>
         </w:tc>
@@ -7551,7 +7551,7 @@
         <w:t xml:space="preserve">26/30</w:t>
       </w:r>
       <w:r>
-        <w:t xml:space="preserve">, evidence 1.60. HO-02 informed an earlier fix, so the set is not fully held out. The four lost points:</w:t>
+        <w:t xml:space="preserve">, evidence 1.60. HO-02 informed an earlier fix, so the set is not fully held out. A regrade after these results were known, with the same evidence the development judge sees, gave 27/30; the first grading is the reported result. The four lost points:</w:t>
       </w:r>
     </w:p>
     <w:p>
@@ -8199,6 +8199,90 @@
                 <w:szCs w:val="19"/>
               </w:rPr>
               <w:t xml:space="preserve">An unsigned draft plan can replace a signed goal</w:t>
+            </w:r>
+          </w:p>
+        </w:tc>
+      </w:tr>
+      <w:tr>
+        <w:trPr>
+          <w:cantSplit/>
+          <w:tblHeader w:val="false"/>
+        </w:trPr>
+        <w:tc>
+          <w:tcPr>
+            <w:tcW w:type="dxa" w:w="2500"/>
+            <w:tcBorders>
+              <w:top w:val="single" w:color="BFBFBF" w:sz="4"/>
+              <w:left w:val="single" w:color="BFBFBF" w:sz="4"/>
+              <w:bottom w:val="single" w:color="BFBFBF" w:sz="4"/>
+              <w:right w:val="single" w:color="BFBFBF" w:sz="4"/>
+            </w:tcBorders>
+            <w:tcMar>
+              <w:top w:type="dxa" w:w="60"/>
+              <w:left w:type="dxa" w:w="100"/>
+              <w:bottom w:type="dxa" w:w="60"/>
+              <w:right w:type="dxa" w:w="100"/>
+            </w:tcMar>
+          </w:tcPr>
+          <w:p>
+            <w:r>
+              <w:rPr>
+                <w:sz w:val="19"/>
+                <w:szCs w:val="19"/>
+              </w:rPr>
+              <w:t xml:space="preserve">Wording errors the judge missed</w:t>
+            </w:r>
+          </w:p>
+        </w:tc>
+        <w:tc>
+          <w:tcPr>
+            <w:tcW w:type="dxa" w:w="2860"/>
+            <w:tcBorders>
+              <w:top w:val="single" w:color="BFBFBF" w:sz="4"/>
+              <w:left w:val="single" w:color="BFBFBF" w:sz="4"/>
+              <w:bottom w:val="single" w:color="BFBFBF" w:sz="4"/>
+              <w:right w:val="single" w:color="BFBFBF" w:sz="4"/>
+            </w:tcBorders>
+            <w:tcMar>
+              <w:top w:type="dxa" w:w="60"/>
+              <w:left w:type="dxa" w:w="100"/>
+              <w:bottom w:type="dxa" w:w="60"/>
+              <w:right w:type="dxa" w:w="100"/>
+            </w:tcMar>
+          </w:tcPr>
+          <w:p>
+            <w:r>
+              <w:rPr>
+                <w:sz w:val="19"/>
+                <w:szCs w:val="19"/>
+              </w:rPr>
+              <w:t xml:space="preserve">DEV-01, DEV-02, DEV-05 in the later rerun of the five development questions (all graded 2)</w:t>
+            </w:r>
+          </w:p>
+        </w:tc>
+        <w:tc>
+          <w:tcPr>
+            <w:tcW w:type="dxa" w:w="4000"/>
+            <w:tcBorders>
+              <w:top w:val="single" w:color="BFBFBF" w:sz="4"/>
+              <w:left w:val="single" w:color="BFBFBF" w:sz="4"/>
+              <w:bottom w:val="single" w:color="BFBFBF" w:sz="4"/>
+              <w:right w:val="single" w:color="BFBFBF" w:sz="4"/>
+            </w:tcBorders>
+            <w:tcMar>
+              <w:top w:type="dxa" w:w="60"/>
+              <w:left w:type="dxa" w:w="100"/>
+              <w:bottom w:type="dxa" w:w="60"/>
+              <w:right w:type="dxa" w:w="100"/>
+            </w:tcMar>
+          </w:tcPr>
+          <w:p>
+            <w:r>
+              <w:rPr>
+                <w:sz w:val="19"/>
+                <w:szCs w:val="19"/>
+              </w:rPr>
+              <w:t xml:space="preserve">“Eight encounters were attended but excluded” lists two no-shows and two cancellations; “Rowan and the patient” (Rowan is the patient); both January 26 notes called “primary” (BH-D111 is the participating clinician’s record)</w:t>
             </w:r>
           </w:p>
         </w:tc>

</xml_diff>

<commit_message>
Update evaluation section and list weighted-linking limitation
Word doc: align test count, status counts and stability wording with the
submitted record; add changed-input scenarios, judge model, wording errors
the judge missed, held-out regrade note, and the linking fix.
README: add weighted linking to What didn't work.

Co-Authored-By: Claude Opus 5.5 <noreply@anthropic.com>
Claude-Session: https://claude.ai/code/session_01RXULkxk3SYELZd3nidRnob
</commit_message>
<xml_diff>
--- a/Clinical record engine - design implementation and evaluation.docx
+++ b/Clinical record engine - design implementation and evaluation.docx
@@ -1421,7 +1421,7 @@
               <w:rPr>
                 <w:rtl w:val="0"/>
               </w:rPr>
-              <w:t xml:space="preserve">1,310</w:t>
+              <w:t xml:space="preserve">1,524</w:t>
             </w:r>
           </w:p>
         </w:tc>
@@ -1469,7 +1469,7 @@
               <w:rPr>
                 <w:rtl w:val="0"/>
               </w:rPr>
-              <w:t xml:space="preserve">71</w:t>
+              <w:t xml:space="preserve">77</w:t>
             </w:r>
           </w:p>
         </w:tc>
@@ -1565,7 +1565,7 @@
               <w:rPr>
                 <w:rtl w:val="0"/>
               </w:rPr>
-              <w:t xml:space="preserve">5</w:t>
+              <w:t xml:space="preserve">4</w:t>
             </w:r>
           </w:p>
         </w:tc>
@@ -5624,7 +5624,7 @@
         <w:t xml:space="preserve">Held-out set (15 questions).</w:t>
       </w:r>
       <w:r>
-        <w:t xml:space="preserve"> Written from the documents in the same format, with reference answers, and kept out of development. It covers weekly goals, PHQ-9 change, undelivered appointments, coordination, partner-only time, same-day contacts, clinicians, signatures, a correct absence claim and elapsed time across a correction.</w:t>
+        <w:t xml:space="preserve"> Written from the documents in the same format, with reference answers, and kept out of development except that HO-02 informed one earlier fix. It covers weekly goals, PHQ-9 change, undelivered appointments, coordination, partner-only time, same-day contacts, clinicians, signatures, a correct absence claim and elapsed time across a correction.</w:t>
       </w:r>
     </w:p>
     <w:p>
@@ -5659,7 +5659,7 @@
         <w:t xml:space="preserve">4/4 questions, 55/55 fields</w:t>
       </w:r>
       <w:r>
-        <w:t xml:space="preserve">). All five development questions were published; DEV-02–04 scored full marks, and DEV-01 and DEV-05 lost one point each for detail. On 15 held-out questions it scored </w:t>
+        <w:t xml:space="preserve">). All five development questions were published; in the benchmark run DEV-02–04 scored full marks and DEV-01 and DEV-05 lost one point each for detail, and a later cold re-run on the current code scored full marks on all five, although a manual read found three wording errors the judge missed. On 15 held-out questions it scored </w:t>
       </w:r>
       <w:r>
         <w:rPr>
@@ -5679,7 +5679,7 @@
         <w:t xml:space="preserve">identical episode ledger</w:t>
       </w:r>
       <w:r>
-        <w:t xml:space="preserve">. The main weaknesses are citation recall (0.43) and answers that sometimes include the wrong detail.</w:t>
+        <w:t xml:space="preserve">. The main weaknesses are citation recall (0.43), answers that sometimes include the wrong detail, and a model judge that misses wording errors. Two known correctness gaps (goal replacement and weighted linking) are not triggered by this packet but are listed below.</w:t>
       </w:r>
     </w:p>
     <w:p>
@@ -5905,7 +5905,7 @@
                 <w:sz w:val="19"/>
                 <w:szCs w:val="19"/>
               </w:rPr>
-              <w:t xml:space="preserve">144 tests</w:t>
+              <w:t xml:space="preserve">144 tests, plus 2 browser tests</w:t>
             </w:r>
           </w:p>
         </w:tc>
@@ -6041,7 +6041,7 @@
                 <w:sz w:val="19"/>
                 <w:szCs w:val="19"/>
               </w:rPr>
-              <w:t xml:space="preserve">Deterministic scorer + blind model judge</w:t>
+              <w:t xml:space="preserve">Deterministic scorer + blind model judge (Sonnet 4.6, the model that also writes the answers)</w:t>
             </w:r>
           </w:p>
         </w:tc>
@@ -6262,6 +6262,116 @@
                 <w:szCs w:val="19"/>
               </w:rPr>
               <w:t xml:space="preserve">Fact-by-fact comparison of two builds</w:t>
+            </w:r>
+          </w:p>
+        </w:tc>
+      </w:tr>
+      <w:tr>
+        <w:trPr>
+          <w:cantSplit/>
+          <w:tblHeader w:val="false"/>
+        </w:trPr>
+        <w:tc>
+          <w:tcPr>
+            <w:tcW w:type="dxa" w:w="1900"/>
+            <w:tcBorders>
+              <w:top w:val="single" w:color="BFBFBF" w:sz="4"/>
+              <w:left w:val="single" w:color="BFBFBF" w:sz="4"/>
+              <w:bottom w:val="single" w:color="BFBFBF" w:sz="4"/>
+              <w:right w:val="single" w:color="BFBFBF" w:sz="4"/>
+            </w:tcBorders>
+            <w:tcMar>
+              <w:top w:type="dxa" w:w="60"/>
+              <w:left w:type="dxa" w:w="100"/>
+              <w:bottom w:type="dxa" w:w="60"/>
+              <w:right w:type="dxa" w:w="100"/>
+            </w:tcMar>
+          </w:tcPr>
+          <w:p>
+            <w:r>
+              <w:rPr>
+                <w:sz w:val="19"/>
+                <w:szCs w:val="19"/>
+              </w:rPr>
+              <w:t xml:space="preserve">Changed-input scenarios</w:t>
+            </w:r>
+          </w:p>
+        </w:tc>
+        <w:tc>
+          <w:tcPr>
+            <w:tcW w:type="dxa" w:w="3060"/>
+            <w:tcBorders>
+              <w:top w:val="single" w:color="BFBFBF" w:sz="4"/>
+              <w:left w:val="single" w:color="BFBFBF" w:sz="4"/>
+              <w:bottom w:val="single" w:color="BFBFBF" w:sz="4"/>
+              <w:right w:val="single" w:color="BFBFBF" w:sz="4"/>
+            </w:tcBorders>
+            <w:tcMar>
+              <w:top w:type="dxa" w:w="60"/>
+              <w:left w:type="dxa" w:w="100"/>
+              <w:bottom w:type="dxa" w:w="60"/>
+              <w:right w:type="dxa" w:w="100"/>
+            </w:tcMar>
+          </w:tcPr>
+          <w:p>
+            <w:r>
+              <w:rPr>
+                <w:sz w:val="19"/>
+                <w:szCs w:val="19"/>
+              </w:rPr>
+              <w:t xml:space="preserve">Does the record respond correctly when documents are added?</w:t>
+            </w:r>
+          </w:p>
+        </w:tc>
+        <w:tc>
+          <w:tcPr>
+            <w:tcW w:type="dxa" w:w="2200"/>
+            <w:tcBorders>
+              <w:top w:val="single" w:color="BFBFBF" w:sz="4"/>
+              <w:left w:val="single" w:color="BFBFBF" w:sz="4"/>
+              <w:bottom w:val="single" w:color="BFBFBF" w:sz="4"/>
+              <w:right w:val="single" w:color="BFBFBF" w:sz="4"/>
+            </w:tcBorders>
+            <w:tcMar>
+              <w:top w:type="dxa" w:w="60"/>
+              <w:left w:type="dxa" w:w="100"/>
+              <w:bottom w:type="dxa" w:w="60"/>
+              <w:right w:type="dxa" w:w="100"/>
+            </w:tcMar>
+          </w:tcPr>
+          <w:p>
+            <w:r>
+              <w:rPr>
+                <w:sz w:val="19"/>
+                <w:szCs w:val="19"/>
+              </w:rPr>
+              <w:t xml:space="preserve">13 scenarios (engine 0.2)</w:t>
+            </w:r>
+          </w:p>
+        </w:tc>
+        <w:tc>
+          <w:tcPr>
+            <w:tcW w:type="dxa" w:w="2200"/>
+            <w:tcBorders>
+              <w:top w:val="single" w:color="BFBFBF" w:sz="4"/>
+              <w:left w:val="single" w:color="BFBFBF" w:sz="4"/>
+              <w:bottom w:val="single" w:color="BFBFBF" w:sz="4"/>
+              <w:right w:val="single" w:color="BFBFBF" w:sz="4"/>
+            </w:tcBorders>
+            <w:tcMar>
+              <w:top w:type="dxa" w:w="60"/>
+              <w:left w:type="dxa" w:w="100"/>
+              <w:bottom w:type="dxa" w:w="60"/>
+              <w:right w:type="dxa" w:w="100"/>
+            </w:tcMar>
+          </w:tcPr>
+          <w:p>
+            <w:r>
+              <w:rPr>
+                <w:sz w:val="19"/>
+                <w:szCs w:val="19"/>
+              </w:rPr>
+              <w:t xml:space="preserve">Deterministic record and answer checks + the same judge</w:t>
             </w:r>
           </w:p>
         </w:tc>
@@ -7197,7 +7307,7 @@
                 <w:sz w:val="19"/>
                 <w:szCs w:val="19"/>
               </w:rPr>
-              <w:t xml:space="preserve">5/5 published; DEV-02–04 factual 2, DEV-01 and DEV-05 factual 1; all evidence 2</w:t>
+              <w:t xml:space="preserve">5/5 published; DEV-02–04 factual 2, DEV-01 and DEV-05 factual 1; all evidence 2. Cold re-run on the current code: factual 2 and evidence 2 on all five (see below)</w:t>
             </w:r>
           </w:p>
         </w:tc>
@@ -7530,28 +7640,43 @@
     </w:p>
     <w:p>
       <w:pPr>
-        <w:pStyle w:val="Heading3"/>
-      </w:pPr>
-      <w:r>
-        <w:t xml:space="preserve">Held-out set (15 questions)</w:t>
-      </w:r>
-    </w:p>
-    <w:p>
-      <w:pPr>
         <w:spacing w:after="120"/>
       </w:pPr>
-      <w:r>
-        <w:t xml:space="preserve">15/15 published; judge factual </w:t>
-      </w:r>
       <w:r>
         <w:rPr>
           <w:b/>
           <w:bCs/>
         </w:rPr>
+        <w:t xml:space="preserve">Wording errors the judge missed.</w:t>
+      </w:r>
+      <w:r>
+        <w:t xml:space="preserve"> A manual read of the re-run DEV-01–05 answers found three errors that change no number, and all three still scored full marks. DEV-01 says eight encounters “were attended but excluded”, but the list includes two no-shows and two cancellations. DEV-05 says “Rowan and the patient both reported”; Rowan is the patient. DEV-02 calls both January 26 notes “primary clinical records”; BH-D111 is the participating clinician’s record. The judge is the same model that writes the answers, so its scores are treated as advisory.</w:t>
+      </w:r>
+    </w:p>
+    <w:p>
+      <w:pPr>
+        <w:pStyle w:val="Heading3"/>
+      </w:pPr>
+      <w:r>
+        <w:t xml:space="preserve">Held-out set (15 questions)</w:t>
+      </w:r>
+    </w:p>
+    <w:p>
+      <w:pPr>
+        <w:spacing w:after="120"/>
+      </w:pPr>
+      <w:r>
+        <w:t xml:space="preserve">15/15 published; judge factual </w:t>
+      </w:r>
+      <w:r>
+        <w:rPr>
+          <w:b/>
+          <w:bCs/>
+        </w:rPr>
         <w:t xml:space="preserve">26/30</w:t>
       </w:r>
       <w:r>
-        <w:t xml:space="preserve">, evidence 1.60. HO-02 informed an earlier fix, so the set is not fully held out. A regrade after these results were known, with the same evidence the development judge sees, gave 27/30; the first grading is the reported result. The four lost points:</w:t>
+        <w:t xml:space="preserve">, evidence 1.60. HO-02 informed an earlier fix, so the set is not fully held out. The four lost points:</w:t>
       </w:r>
     </w:p>
     <w:p>
@@ -7636,6 +7761,14 @@
     </w:p>
     <w:p>
       <w:pPr>
+        <w:spacing w:after="120"/>
+      </w:pPr>
+      <w:r>
+        <w:t xml:space="preserve">After these results were known, the set was regraded with the same evidence the development judge sees, which gave 27/30 (evidence 1.87). The first grading is the result reported here.</w:t>
+      </w:r>
+    </w:p>
+    <w:p>
+      <w:pPr>
         <w:pStyle w:val="Heading3"/>
       </w:pPr>
       <w:r>
@@ -7657,7 +7790,7 @@
         <w:t xml:space="preserve">identical</w:t>
       </w:r>
       <w:r>
-        <w:t xml:space="preserve">: every count, total, weekly result and encounter contribution. Of 402 non-text facts, 22 differ, and none of them is counted anywhere. They are mostly administrative contacts that one build recorded and the other did not, or a difference in how strongly a value is confirmed (one source vs several).</w:t>
+        <w:t xml:space="preserve">: every count, total, weekly result and encounter contribution. Of 402 non-text facts, 22 differ, and none of them changes a count, total or weekly result. They are mostly administrative contacts that one build recorded and the other did not, or a difference in how strongly a value is confirmed (one source vs several).</w:t>
       </w:r>
     </w:p>
     <w:p>
@@ -7666,6 +7799,21 @@
       </w:pPr>
       <w:r>
         <w:t xml:space="preserve">Across the two readings of each document, 40 points disagreed: 30 were settled by a focused re-read, and 10 remain open items, mostly outreach-call dates and times.</w:t>
+      </w:r>
+    </w:p>
+    <w:p>
+      <w:pPr>
+        <w:spacing w:after="120"/>
+      </w:pPr>
+      <w:r>
+        <w:rPr>
+          <w:b/>
+          <w:bCs/>
+        </w:rPr>
+        <w:t xml:space="preserve">Changed-input scenarios.</w:t>
+      </w:r>
+      <w:r>
+        <w:t xml:space="preserve"> Thirteen scenarios each add documents to the packet with a known expected effect: a late-entry addendum, a CSV scheduling export, a session documented only by a stated length, an e-mail correction, an OCR-damaged draft, a paid claim line for a cancelled visit, another patient’s note, a reused visit number at another clinic, a withdrawn plan, a plan amendment, a JSON video-platform log, a re-imported measure form and an equal-standing no-show note. Record checks passed 30/30; 14/14 answers were published, 13/14 passed their answer checks, and the judge scored 26/28. These ran on engine 0.2 and were not re-run for 0.3.</w:t>
       </w:r>
     </w:p>
     <w:p>
@@ -8230,7 +8378,7 @@
                 <w:sz w:val="19"/>
                 <w:szCs w:val="19"/>
               </w:rPr>
-              <w:t xml:space="preserve">Wording errors the judge missed</w:t>
+              <w:t xml:space="preserve">Weighted linking can merge distinct sessions</w:t>
             </w:r>
           </w:p>
         </w:tc>
@@ -8256,7 +8404,7 @@
                 <w:sz w:val="19"/>
                 <w:szCs w:val="19"/>
               </w:rPr>
-              <w:t xml:space="preserve">DEV-01, DEV-02, DEV-05 in the later rerun of the five development questions (all graded 2)</w:t>
+              <w:t xml:space="preserve">Linking without a shared visit ID (not triggered in this packet)</w:t>
             </w:r>
           </w:p>
         </w:tc>
@@ -8282,7 +8430,91 @@
                 <w:sz w:val="19"/>
                 <w:szCs w:val="19"/>
               </w:rPr>
-              <w:t xml:space="preserve">“Eight encounters were attended but excluded” lists two no-shows and two cancellations; “Rowan and the patient” (Rowan is the patient); both January 26 notes called “primary” (BH-D111 is the participating clinician’s record)</w:t>
+              <w:t xml:space="preserve">Participants match on any shared word, so two same-day sessions from different documents whose clinicians share a credential (e.g. LCSW) reach the 0.8 link threshold with no time overlap</w:t>
+            </w:r>
+          </w:p>
+        </w:tc>
+      </w:tr>
+      <w:tr>
+        <w:trPr>
+          <w:cantSplit/>
+          <w:tblHeader w:val="false"/>
+        </w:trPr>
+        <w:tc>
+          <w:tcPr>
+            <w:tcW w:type="dxa" w:w="2500"/>
+            <w:tcBorders>
+              <w:top w:val="single" w:color="BFBFBF" w:sz="4"/>
+              <w:left w:val="single" w:color="BFBFBF" w:sz="4"/>
+              <w:bottom w:val="single" w:color="BFBFBF" w:sz="4"/>
+              <w:right w:val="single" w:color="BFBFBF" w:sz="4"/>
+            </w:tcBorders>
+            <w:tcMar>
+              <w:top w:type="dxa" w:w="60"/>
+              <w:left w:type="dxa" w:w="100"/>
+              <w:bottom w:type="dxa" w:w="60"/>
+              <w:right w:type="dxa" w:w="100"/>
+            </w:tcMar>
+          </w:tcPr>
+          <w:p>
+            <w:r>
+              <w:rPr>
+                <w:sz w:val="19"/>
+                <w:szCs w:val="19"/>
+              </w:rPr>
+              <w:t xml:space="preserve">Judge misses wording errors</w:t>
+            </w:r>
+          </w:p>
+        </w:tc>
+        <w:tc>
+          <w:tcPr>
+            <w:tcW w:type="dxa" w:w="2860"/>
+            <w:tcBorders>
+              <w:top w:val="single" w:color="BFBFBF" w:sz="4"/>
+              <w:left w:val="single" w:color="BFBFBF" w:sz="4"/>
+              <w:bottom w:val="single" w:color="BFBFBF" w:sz="4"/>
+              <w:right w:val="single" w:color="BFBFBF" w:sz="4"/>
+            </w:tcBorders>
+            <w:tcMar>
+              <w:top w:type="dxa" w:w="60"/>
+              <w:left w:type="dxa" w:w="100"/>
+              <w:bottom w:type="dxa" w:w="60"/>
+              <w:right w:type="dxa" w:w="100"/>
+            </w:tcMar>
+          </w:tcPr>
+          <w:p>
+            <w:r>
+              <w:rPr>
+                <w:sz w:val="19"/>
+                <w:szCs w:val="19"/>
+              </w:rPr>
+              <w:t xml:space="preserve">DEV-01, 02 and 05 in the re-run (full marks despite errors)</w:t>
+            </w:r>
+          </w:p>
+        </w:tc>
+        <w:tc>
+          <w:tcPr>
+            <w:tcW w:type="dxa" w:w="4000"/>
+            <w:tcBorders>
+              <w:top w:val="single" w:color="BFBFBF" w:sz="4"/>
+              <w:left w:val="single" w:color="BFBFBF" w:sz="4"/>
+              <w:bottom w:val="single" w:color="BFBFBF" w:sz="4"/>
+              <w:right w:val="single" w:color="BFBFBF" w:sz="4"/>
+            </w:tcBorders>
+            <w:tcMar>
+              <w:top w:type="dxa" w:w="60"/>
+              <w:left w:type="dxa" w:w="100"/>
+              <w:bottom w:type="dxa" w:w="60"/>
+              <w:right w:type="dxa" w:w="100"/>
+            </w:tcMar>
+          </w:tcPr>
+          <w:p>
+            <w:r>
+              <w:rPr>
+                <w:sz w:val="19"/>
+                <w:szCs w:val="19"/>
+              </w:rPr>
+              <w:t xml:space="preserve">The model judge compares facts with the reference and does not catch every wrong word; a manual read found three</w:t>
             </w:r>
           </w:p>
         </w:tc>
@@ -8310,10 +8542,10 @@
           <w:b/>
           <w:bCs/>
         </w:rPr>
-        <w:t xml:space="preserve">Fix the two correctness gaps:</w:t>
-      </w:r>
-      <w:r>
-        <w:t xml:space="preserve"> make goal replacement respect attestation, and widen the value parser (words, HL7 and ISO timestamps). Add both as regression tests.</w:t>
+        <w:t xml:space="preserve">Fix the three correctness gaps:</w:t>
+      </w:r>
+      <w:r>
+        <w:t xml:space="preserve"> make goal replacement respect attestation, require overlapping times before a weighted match can link (and compare participants by full name), and widen the value parser (words, HL7 and ISO timestamps). Add each as a regression test.</w:t>
       </w:r>
     </w:p>
     <w:p>
@@ -8353,7 +8585,7 @@
         <w:t xml:space="preserve">Tighten answer scope:</w:t>
       </w:r>
       <w:r>
-        <w:t xml:space="preserve"> check statements against the question’s named events, dates and quantities, and require every figure the checklist names.</w:t>
+        <w:t xml:space="preserve"> check statements against the question’s named events, dates and quantities, require every figure the checklist names, and check in code that status words such as “attended” match each encounter’s reconciled status.</w:t>
       </w:r>
     </w:p>
     <w:p>
@@ -8950,7 +9182,7 @@
           <w:vertAlign w:val="baseline"/>
           <w:rtl w:val="0"/>
         </w:rPr>
-        <w:t xml:space="preserve"> Widen the value parser to read dates and times written in words and compact timestamps, and make goal replacement respect attestation so a draft plan cannot replace a signed one. Then test on a second patient.</w:t>
+        <w:t xml:space="preserve"> Widen the value parser to read dates and times written in words and compact timestamps, make goal replacement respect attestation so a draft plan cannot replace a signed one, and require overlapping times before a weighted match can link two sessions. Then test on a second patient.</w:t>
       </w:r>
     </w:p>
     <w:p>

</xml_diff>